<commit_message>
Project charter completed. 2 team member roles need to be inserted
</commit_message>
<xml_diff>
--- a/09_Project_Management_Evidence/Project_Charter_and_Work_Plan.docx
+++ b/09_Project_Management_Evidence/Project_Charter_and_Work_Plan.docx
@@ -229,27 +229,17 @@
     </w:p>
     <w:p>
       <w:r>
-        <w:t>Provide title, background and business/research need.</w:t>
+        <w:t>TrackWIL replaces lost PDF and email workplace logbooks for occupational students at CTU Cape Town.</w:t>
       </w:r>
     </w:p>
     <w:p>
       <w:r>
-        <w:t>________________________________________________________________________________</w:t>
+        <w:t>Students, host employers, and coordinators need one place to record, verify, and see required hours.</w:t>
       </w:r>
     </w:p>
     <w:p>
       <w:r>
-        <w:t>________________________________________________________________________________</w:t>
-      </w:r>
-    </w:p>
-    <w:p>
-      <w:r>
-        <w:t>________________________________________________________________________________</w:t>
-      </w:r>
-    </w:p>
-    <w:p>
-      <w:r>
-        <w:t>________________________________________________________________________________</w:t>
+        <w:t>The core product is due on 29 October 2026: logbook entry, token verification, and a coordinator dashboard.</w:t>
       </w:r>
     </w:p>
     <w:p>
@@ -262,27 +252,17 @@
     </w:p>
     <w:p>
       <w:r>
-        <w:t>Record the approved aim and objectives.</w:t>
+        <w:t>The aim is to build and evaluate TrackWIL so coordinators can see hour compliance without a manual file audit.</w:t>
       </w:r>
     </w:p>
     <w:p>
       <w:r>
-        <w:t>________________________________________________________________________________</w:t>
+        <w:t>Objective 1 is logbook entry with evidence and progress; objective 2 is employer sign-off by a secure token link.</w:t>
       </w:r>
     </w:p>
     <w:p>
       <w:r>
-        <w:t>________________________________________________________________________________</w:t>
-      </w:r>
-    </w:p>
-    <w:p>
-      <w:r>
-        <w:t>________________________________________________________________________________</w:t>
-      </w:r>
-    </w:p>
-    <w:p>
-      <w:r>
-        <w:t>________________________________________________________________________________</w:t>
+        <w:t>Objective 3 is a dashboard of on-track, awaiting, and overdue logbooks; analytics and exports stay stretch goals.</w:t>
       </w:r>
     </w:p>
     <w:p>
@@ -295,32 +275,17 @@
     </w:p>
     <w:p>
       <w:r>
-        <w:t>List project boundaries and major outputs.</w:t>
+        <w:t>In scope are the three core features, the dissertation chapters, ethical clearance, GitHub evidence, tests, and the demo.</w:t>
       </w:r>
     </w:p>
     <w:p>
       <w:r>
-        <w:t>________________________________________________________________________________</w:t>
+        <w:t>Analytics, bulk exports, audit logs, and staff or student data collected before written campus permission are out of scope.</w:t>
       </w:r>
     </w:p>
     <w:p>
       <w:r>
-        <w:t>________________________________________________________________________________</w:t>
-      </w:r>
-    </w:p>
-    <w:p>
-      <w:r>
-        <w:t>________________________________________________________________________________</w:t>
-      </w:r>
-    </w:p>
-    <w:p>
-      <w:r>
-        <w:t>________________________________________________________________________________</w:t>
-      </w:r>
-    </w:p>
-    <w:p>
-      <w:r>
-        <w:t>________________________________________________________________________________</w:t>
+        <w:t>Deliverables are the web app, this charter, the weekly submissions, the dissertation, and the 29 October demonstration.</w:t>
       </w:r>
     </w:p>
     <w:p>
@@ -333,33 +298,17 @@
     </w:p>
     <w:p>
       <w:r>
-        <w:t>Assign project roles and responsibilities.</w:t>
+        <w:t>Willem Basson is group lead and owns client contact, the repository, milestones, and ethical clearance.</w:t>
       </w:r>
     </w:p>
     <w:p>
       <w:r>
-        <w:t>________________________________________________________________________________</w:t>
+        <w:t>Sihle Kayise owns Chapter 1, Dylan Shepard owns Chapter 2, and Moegammad Green owns this charter and work plan.</w:t>
       </w:r>
     </w:p>
     <w:p>
       <w:r>
-        <w:t>________________________________________________________________________________</w:t>
-      </w:r>
-    </w:p>
-    <w:p>
-      <w:r>
-        <w:t>________________________________________________________________________________</w:t>
-      </w:r>
-    </w:p>
-    <w:p>
-      <w:r>
-        <w:lastRenderedPageBreak/>
-        <w:t>________________________________________________________________________________</w:t>
-      </w:r>
-    </w:p>
-    <w:p>
-      <w:r>
-        <w:t>________________________________________________________________________________</w:t>
+        <w:t>All four members share design, the core build, testing, and the final dissertation and demonstration.</w:t>
       </w:r>
     </w:p>
     <w:p>
@@ -372,32 +321,18 @@
     </w:p>
     <w:p>
       <w:r>
-        <w:t>Identify major weekly milestones and expected completion dates.</w:t>
+        <w:t>9 October 2026: submit Chapters 1 and 2, this charter, ethical clearance, and the GitHub repository link.</w:t>
       </w:r>
     </w:p>
     <w:p>
       <w:r>
-        <w:t>________________________________________________________________________________</w:t>
+        <w:lastRenderedPageBreak/>
+        <w:t>16 October: requirements and design; 23 October: core build and tests of logbook, token, and dashboard.</w:t>
       </w:r>
     </w:p>
     <w:p>
       <w:r>
-        <w:t>________________________________________________________________________________</w:t>
-      </w:r>
-    </w:p>
-    <w:p>
-      <w:r>
-        <w:t>________________________________________________________________________________</w:t>
-      </w:r>
-    </w:p>
-    <w:p>
-      <w:r>
-        <w:t>________________________________________________________________________________</w:t>
-      </w:r>
-    </w:p>
-    <w:p>
-      <w:r>
-        <w:t>________________________________________________________________________________</w:t>
+        <w:t>29 October 2026: dissertation, working app, evidence folders, and demonstration; nothing is planned after that date.</w:t>
       </w:r>
     </w:p>
     <w:p>
@@ -410,32 +345,17 @@
     </w:p>
     <w:p>
       <w:r>
-        <w:t>Summarise major risks, assumptions and constraints.</w:t>
+        <w:t>Permission to use staff or student data may arrive late, so evaluation uses synthetic data until POPIA consent exists.</w:t>
       </w:r>
     </w:p>
     <w:p>
       <w:r>
-        <w:t>________________________________________________________________________________</w:t>
+        <w:t>The scope risk is treating analytics, bulk exports, or audit logs as required work before the core product is done.</w:t>
       </w:r>
     </w:p>
     <w:p>
       <w:r>
-        <w:t>________________________________________________________________________________</w:t>
-      </w:r>
-    </w:p>
-    <w:p>
-      <w:r>
-        <w:t>________________________________________________________________________________</w:t>
-      </w:r>
-    </w:p>
-    <w:p>
-      <w:r>
-        <w:t>________________________________________________________________________________</w:t>
-      </w:r>
-    </w:p>
-    <w:p>
-      <w:r>
-        <w:t>________________________________________________________________________________</w:t>
+        <w:t>If a Friday milestone slips, the owner tells Willem Basson that week and the group cuts back to the three core features.</w:t>
       </w:r>
     </w:p>
     <w:p>
@@ -448,22 +368,17 @@
     </w:p>
     <w:p>
       <w:r>
-        <w:t>Supervisor and group representative sign-off.</w:t>
+        <w:t>This version 1 charter is the Week 2 plan submitted for supervisor review on 9 October 2026.</w:t>
       </w:r>
     </w:p>
     <w:p>
       <w:r>
-        <w:t>________________________________________________________________________________</w:t>
+        <w:t>Willem Basson signs for the group as lead; Moegammad Green prepared this work plan.</w:t>
       </w:r>
     </w:p>
     <w:p>
       <w:r>
-        <w:t>________________________________________________________________________________</w:t>
-      </w:r>
-    </w:p>
-    <w:p>
-      <w:r>
-        <w:t>________________________________________________________________________________</w:t>
+        <w:t>Ms Amenda Raganya records supervisor approval after the Week 2 review.</w:t>
       </w:r>
     </w:p>
     <w:sectPr>

</xml_diff>

<commit_message>
Updated member role in project charter - Dylan
</commit_message>
<xml_diff>
--- a/09_Project_Management_Evidence/Project_Charter_and_Work_Plan.docx
+++ b/09_Project_Management_Evidence/Project_Charter_and_Work_Plan.docx
@@ -25,12 +25,21 @@
         </w:rPr>
         <w:br/>
       </w:r>
+      <w:proofErr w:type="spellStart"/>
       <w:r>
         <w:rPr>
           <w:b/>
           <w:sz w:val="40"/>
         </w:rPr>
-        <w:t>PROJECT CHARTER &amp; WORK PLAN</w:t>
+        <w:t>PROJECT</w:t>
+      </w:r>
+      <w:proofErr w:type="spellEnd"/>
+      <w:r>
+        <w:rPr>
+          <w:b/>
+          <w:sz w:val="40"/>
+        </w:rPr>
+        <w:t xml:space="preserve"> CHARTER &amp; WORK PLAN</w:t>
       </w:r>
       <w:r>
         <w:br/>
@@ -228,8 +237,13 @@
       </w:r>
     </w:p>
     <w:p>
+      <w:proofErr w:type="spellStart"/>
       <w:r>
-        <w:t>TrackWIL replaces lost PDF and email workplace logbooks for occupational students at CTU Cape Town.</w:t>
+        <w:t>TrackWIL</w:t>
+      </w:r>
+      <w:proofErr w:type="spellEnd"/>
+      <w:r>
+        <w:t xml:space="preserve"> replaces lost PDF and email workplace logbooks for occupational students at CTU Cape Town.</w:t>
       </w:r>
     </w:p>
     <w:p>
@@ -252,7 +266,15 @@
     </w:p>
     <w:p>
       <w:r>
-        <w:t>The aim is to build and evaluate TrackWIL so coordinators can see hour compliance without a manual file audit.</w:t>
+        <w:t xml:space="preserve">The aim is to build and evaluate </w:t>
+      </w:r>
+      <w:proofErr w:type="spellStart"/>
+      <w:r>
+        <w:t>TrackWIL</w:t>
+      </w:r>
+      <w:proofErr w:type="spellEnd"/>
+      <w:r>
+        <w:t xml:space="preserve"> so coordinators can see hour compliance without a manual file audit.</w:t>
       </w:r>
     </w:p>
     <w:p>
@@ -319,12 +341,20 @@
     </w:p>
     <w:p>
       <w:r>
-        <w:t>Sihle Kayise</w:t>
+        <w:t xml:space="preserve">Sihle </w:t>
       </w:r>
+      <w:proofErr w:type="spellStart"/>
+      <w:r>
+        <w:t>Kayise</w:t>
+      </w:r>
+      <w:proofErr w:type="spellEnd"/>
     </w:p>
     <w:p>
       <w:r>
         <w:t>Dylan Shepard</w:t>
+      </w:r>
+      <w:r>
+        <w:t xml:space="preserve"> is in charge of QA so that the project reaches its requirements</w:t>
       </w:r>
     </w:p>
     <w:p>
@@ -432,8 +462,21 @@
       </w:r>
     </w:p>
     <w:p>
+      <w:proofErr w:type="spellStart"/>
       <w:r>
-        <w:t>Ms Amenda Raganya records supervisor approval after the Week 2 review.</w:t>
+        <w:t>Ms</w:t>
+      </w:r>
+      <w:proofErr w:type="spellEnd"/>
+      <w:r>
+        <w:t xml:space="preserve"> Amenda </w:t>
+      </w:r>
+      <w:proofErr w:type="spellStart"/>
+      <w:r>
+        <w:t>Raganya</w:t>
+      </w:r>
+      <w:proofErr w:type="spellEnd"/>
+      <w:r>
+        <w:t xml:space="preserve"> records supervisor approval after the Week 2 review.</w:t>
       </w:r>
     </w:p>
     <w:sectPr>

</xml_diff>

<commit_message>
Appended the missing work plan to the apropriate word document
</commit_message>
<xml_diff>
--- a/09_Project_Management_Evidence/Project_Charter_and_Work_Plan.docx
+++ b/09_Project_Management_Evidence/Project_Charter_and_Work_Plan.docx
@@ -25,21 +25,12 @@
         </w:rPr>
         <w:br/>
       </w:r>
-      <w:proofErr w:type="spellStart"/>
       <w:r>
         <w:rPr>
           <w:b/>
           <w:sz w:val="40"/>
         </w:rPr>
-        <w:t>PROJECT</w:t>
-      </w:r>
-      <w:proofErr w:type="spellEnd"/>
-      <w:r>
-        <w:rPr>
-          <w:b/>
-          <w:sz w:val="40"/>
-        </w:rPr>
-        <w:t xml:space="preserve"> CHARTER &amp; WORK PLAN</w:t>
+        <w:t>PROJECT CHARTER &amp; WORK PLAN</w:t>
       </w:r>
       <w:r>
         <w:br/>
@@ -338,6 +329,9 @@
       <w:r>
         <w:t xml:space="preserve"> is in charge of QA so that the project reaches its requirements</w:t>
       </w:r>
+      <w:r>
+        <w:t>.</w:t>
+      </w:r>
     </w:p>
     <w:p>
       <w:r>
@@ -444,15 +438,986 @@
       </w:r>
     </w:p>
     <w:p>
-      <w:proofErr w:type="spellStart"/>
       <w:r>
-        <w:t>Ms</w:t>
-      </w:r>
-      <w:proofErr w:type="spellEnd"/>
-      <w:r>
-        <w:t xml:space="preserve"> Amenda Raganya records supervisor approval after the Week 2 review.</w:t>
+        <w:t>Ms Amenda Raganya records supervisor approval after the Week 2 review.</w:t>
       </w:r>
     </w:p>
+    <w:p>
+      <w:r>
+        <w:br w:type="page"/>
+      </w:r>
+    </w:p>
+    <w:p>
+      <w:pPr>
+        <w:pStyle w:val="Heading1"/>
+      </w:pPr>
+      <w:r>
+        <w:lastRenderedPageBreak/>
+        <w:t>Work plan</w:t>
+      </w:r>
+    </w:p>
+    <w:p/>
+    <w:p>
+      <w:pPr>
+        <w:pStyle w:val="Heading2"/>
+        <w:rPr>
+          <w:lang w:val="en-ZA"/>
+        </w:rPr>
+      </w:pPr>
+      <w:r>
+        <w:rPr>
+          <w:lang w:val="en-ZA"/>
+        </w:rPr>
+        <w:t>Week of 9 October 2026: start and evidence</w:t>
+      </w:r>
+    </w:p>
+    <w:tbl>
+      <w:tblPr>
+        <w:tblStyle w:val="TableGrid"/>
+        <w:tblW w:w="0" w:type="auto"/>
+        <w:tblLook w:val="04A0" w:firstRow="1" w:lastRow="0" w:firstColumn="1" w:lastColumn="0" w:noHBand="0" w:noVBand="1"/>
+      </w:tblPr>
+      <w:tblGrid>
+        <w:gridCol w:w="3320"/>
+        <w:gridCol w:w="3321"/>
+        <w:gridCol w:w="3321"/>
+      </w:tblGrid>
+      <w:tr>
+        <w:trPr>
+          <w:trHeight w:val="567"/>
+        </w:trPr>
+        <w:tc>
+          <w:tcPr>
+            <w:tcW w:w="3320" w:type="dxa"/>
+            <w:vAlign w:val="center"/>
+          </w:tcPr>
+          <w:p>
+            <w:r>
+              <w:t>Task</w:t>
+            </w:r>
+          </w:p>
+        </w:tc>
+        <w:tc>
+          <w:tcPr>
+            <w:tcW w:w="3321" w:type="dxa"/>
+            <w:vAlign w:val="center"/>
+          </w:tcPr>
+          <w:p>
+            <w:r>
+              <w:t>Owner</w:t>
+            </w:r>
+          </w:p>
+        </w:tc>
+        <w:tc>
+          <w:tcPr>
+            <w:tcW w:w="3321" w:type="dxa"/>
+            <w:vAlign w:val="center"/>
+          </w:tcPr>
+          <w:p>
+            <w:r>
+              <w:t>Done when</w:t>
+            </w:r>
+          </w:p>
+        </w:tc>
+      </w:tr>
+      <w:tr>
+        <w:trPr>
+          <w:trHeight w:val="567"/>
+        </w:trPr>
+        <w:tc>
+          <w:tcPr>
+            <w:tcW w:w="3320" w:type="dxa"/>
+            <w:vAlign w:val="center"/>
+          </w:tcPr>
+          <w:p>
+            <w:r>
+              <w:t>Submit Chapters 1 and 2</w:t>
+            </w:r>
+          </w:p>
+        </w:tc>
+        <w:tc>
+          <w:tcPr>
+            <w:tcW w:w="3321" w:type="dxa"/>
+            <w:vAlign w:val="center"/>
+          </w:tcPr>
+          <w:p>
+            <w:r>
+              <w:t>Willem Basson</w:t>
+            </w:r>
+          </w:p>
+        </w:tc>
+        <w:tc>
+          <w:tcPr>
+            <w:tcW w:w="3321" w:type="dxa"/>
+            <w:vAlign w:val="center"/>
+          </w:tcPr>
+          <w:p>
+            <w:r>
+              <w:t>Chapters are in the evidence folders</w:t>
+            </w:r>
+          </w:p>
+        </w:tc>
+      </w:tr>
+      <w:tr>
+        <w:trPr>
+          <w:trHeight w:val="567"/>
+        </w:trPr>
+        <w:tc>
+          <w:tcPr>
+            <w:tcW w:w="3320" w:type="dxa"/>
+            <w:vAlign w:val="center"/>
+          </w:tcPr>
+          <w:p>
+            <w:r>
+              <w:t>Submit this charter and work pla</w:t>
+            </w:r>
+            <w:r>
+              <w:t>n</w:t>
+            </w:r>
+          </w:p>
+        </w:tc>
+        <w:tc>
+          <w:tcPr>
+            <w:tcW w:w="3321" w:type="dxa"/>
+            <w:vAlign w:val="center"/>
+          </w:tcPr>
+          <w:p>
+            <w:r>
+              <w:t>Moegammad Green</w:t>
+            </w:r>
+          </w:p>
+        </w:tc>
+        <w:tc>
+          <w:tcPr>
+            <w:tcW w:w="3321" w:type="dxa"/>
+            <w:vAlign w:val="center"/>
+          </w:tcPr>
+          <w:p>
+            <w:r>
+              <w:t>Charter is ready for supervisor review</w:t>
+            </w:r>
+          </w:p>
+        </w:tc>
+      </w:tr>
+      <w:tr>
+        <w:trPr>
+          <w:trHeight w:val="567"/>
+        </w:trPr>
+        <w:tc>
+          <w:tcPr>
+            <w:tcW w:w="3320" w:type="dxa"/>
+            <w:vAlign w:val="center"/>
+          </w:tcPr>
+          <w:p>
+            <w:r>
+              <w:t>Ethical clearance request</w:t>
+            </w:r>
+          </w:p>
+        </w:tc>
+        <w:tc>
+          <w:tcPr>
+            <w:tcW w:w="3321" w:type="dxa"/>
+            <w:vAlign w:val="center"/>
+          </w:tcPr>
+          <w:p>
+            <w:r>
+              <w:t>Willem Basson</w:t>
+            </w:r>
+          </w:p>
+        </w:tc>
+        <w:tc>
+          <w:tcPr>
+            <w:tcW w:w="3321" w:type="dxa"/>
+            <w:vAlign w:val="center"/>
+          </w:tcPr>
+          <w:p>
+            <w:r>
+              <w:t>Request is submitted; no staff or student data is collected before written permission</w:t>
+            </w:r>
+          </w:p>
+        </w:tc>
+      </w:tr>
+      <w:tr>
+        <w:trPr>
+          <w:trHeight w:val="567"/>
+        </w:trPr>
+        <w:tc>
+          <w:tcPr>
+            <w:tcW w:w="3320" w:type="dxa"/>
+            <w:vAlign w:val="center"/>
+          </w:tcPr>
+          <w:p>
+            <w:r>
+              <w:t>GitHub repository and link</w:t>
+            </w:r>
+          </w:p>
+        </w:tc>
+        <w:tc>
+          <w:tcPr>
+            <w:tcW w:w="3321" w:type="dxa"/>
+            <w:vAlign w:val="center"/>
+          </w:tcPr>
+          <w:p>
+            <w:r>
+              <w:t>Moegammad Green</w:t>
+            </w:r>
+          </w:p>
+        </w:tc>
+        <w:tc>
+          <w:tcPr>
+            <w:tcW w:w="3321" w:type="dxa"/>
+            <w:vAlign w:val="center"/>
+          </w:tcPr>
+          <w:p>
+            <w:r>
+              <w:t>Repository link is recorded for the submission</w:t>
+            </w:r>
+          </w:p>
+        </w:tc>
+      </w:tr>
+      <w:tr>
+        <w:trPr>
+          <w:trHeight w:val="567"/>
+        </w:trPr>
+        <w:tc>
+          <w:tcPr>
+            <w:tcW w:w="3320" w:type="dxa"/>
+            <w:vAlign w:val="center"/>
+          </w:tcPr>
+          <w:p>
+            <w:r>
+              <w:t>Confirm core scope with the group</w:t>
+            </w:r>
+          </w:p>
+        </w:tc>
+        <w:tc>
+          <w:tcPr>
+            <w:tcW w:w="3321" w:type="dxa"/>
+            <w:vAlign w:val="center"/>
+          </w:tcPr>
+          <w:p>
+            <w:r>
+              <w:t>All</w:t>
+            </w:r>
+          </w:p>
+        </w:tc>
+        <w:tc>
+          <w:tcPr>
+            <w:tcW w:w="3321" w:type="dxa"/>
+            <w:vAlign w:val="center"/>
+          </w:tcPr>
+          <w:p>
+            <w:r>
+              <w:t>Logbook, token, and dashboard are the only required product work</w:t>
+            </w:r>
+          </w:p>
+        </w:tc>
+      </w:tr>
+    </w:tbl>
+    <w:p/>
+    <w:p>
+      <w:pPr>
+        <w:pStyle w:val="Heading2"/>
+        <w:rPr>
+          <w:lang w:val="en-ZA"/>
+        </w:rPr>
+      </w:pPr>
+      <w:r>
+        <w:rPr>
+          <w:lang w:val="en-ZA"/>
+        </w:rPr>
+        <w:t>Week of 16 October 2026: requirements and design</w:t>
+      </w:r>
+    </w:p>
+    <w:tbl>
+      <w:tblPr>
+        <w:tblStyle w:val="TableGrid"/>
+        <w:tblW w:w="0" w:type="auto"/>
+        <w:tblLook w:val="04A0" w:firstRow="1" w:lastRow="0" w:firstColumn="1" w:lastColumn="0" w:noHBand="0" w:noVBand="1"/>
+      </w:tblPr>
+      <w:tblGrid>
+        <w:gridCol w:w="3320"/>
+        <w:gridCol w:w="3321"/>
+        <w:gridCol w:w="3321"/>
+      </w:tblGrid>
+      <w:tr>
+        <w:trPr>
+          <w:trHeight w:val="567"/>
+        </w:trPr>
+        <w:tc>
+          <w:tcPr>
+            <w:tcW w:w="3320" w:type="dxa"/>
+            <w:vAlign w:val="center"/>
+          </w:tcPr>
+          <w:p>
+            <w:r>
+              <w:t>Task</w:t>
+            </w:r>
+          </w:p>
+        </w:tc>
+        <w:tc>
+          <w:tcPr>
+            <w:tcW w:w="3321" w:type="dxa"/>
+            <w:vAlign w:val="center"/>
+          </w:tcPr>
+          <w:p>
+            <w:r>
+              <w:t>Owner</w:t>
+            </w:r>
+          </w:p>
+        </w:tc>
+        <w:tc>
+          <w:tcPr>
+            <w:tcW w:w="3321" w:type="dxa"/>
+            <w:vAlign w:val="center"/>
+          </w:tcPr>
+          <w:p>
+            <w:r>
+              <w:t>Done when</w:t>
+            </w:r>
+          </w:p>
+        </w:tc>
+      </w:tr>
+      <w:tr>
+        <w:trPr>
+          <w:trHeight w:val="567"/>
+        </w:trPr>
+        <w:tc>
+          <w:tcPr>
+            <w:tcW w:w="3320" w:type="dxa"/>
+            <w:vAlign w:val="center"/>
+          </w:tcPr>
+          <w:p>
+            <w:r>
+              <w:t>Use cases for student, host employer, and coordinator</w:t>
+            </w:r>
+          </w:p>
+        </w:tc>
+        <w:tc>
+          <w:tcPr>
+            <w:tcW w:w="3321" w:type="dxa"/>
+            <w:vAlign w:val="center"/>
+          </w:tcPr>
+          <w:p>
+            <w:r>
+              <w:t>Sihle Kayise</w:t>
+            </w:r>
+          </w:p>
+        </w:tc>
+        <w:tc>
+          <w:tcPr>
+            <w:tcW w:w="3321" w:type="dxa"/>
+            <w:vAlign w:val="center"/>
+          </w:tcPr>
+          <w:p>
+            <w:r>
+              <w:t>Each core feature has a use case the group agrees on</w:t>
+            </w:r>
+          </w:p>
+        </w:tc>
+      </w:tr>
+      <w:tr>
+        <w:trPr>
+          <w:trHeight w:val="567"/>
+        </w:trPr>
+        <w:tc>
+          <w:tcPr>
+            <w:tcW w:w="3320" w:type="dxa"/>
+            <w:vAlign w:val="center"/>
+          </w:tcPr>
+          <w:p>
+            <w:r>
+              <w:t>Activity flow for entry, token sign-off, and dashboard status</w:t>
+            </w:r>
+          </w:p>
+        </w:tc>
+        <w:tc>
+          <w:tcPr>
+            <w:tcW w:w="3321" w:type="dxa"/>
+            <w:vAlign w:val="center"/>
+          </w:tcPr>
+          <w:p>
+            <w:r>
+              <w:t>Dylan Shepard</w:t>
+            </w:r>
+          </w:p>
+        </w:tc>
+        <w:tc>
+          <w:tcPr>
+            <w:tcW w:w="3321" w:type="dxa"/>
+            <w:vAlign w:val="center"/>
+          </w:tcPr>
+          <w:p>
+            <w:r>
+              <w:t>The three flows are drawn and match the scope</w:t>
+            </w:r>
+          </w:p>
+        </w:tc>
+      </w:tr>
+      <w:tr>
+        <w:trPr>
+          <w:trHeight w:val="567"/>
+        </w:trPr>
+        <w:tc>
+          <w:tcPr>
+            <w:tcW w:w="3320" w:type="dxa"/>
+            <w:vAlign w:val="center"/>
+          </w:tcPr>
+          <w:p>
+            <w:r>
+              <w:t>Data needed for hours, evidence, token, and status</w:t>
+            </w:r>
+          </w:p>
+        </w:tc>
+        <w:tc>
+          <w:tcPr>
+            <w:tcW w:w="3321" w:type="dxa"/>
+            <w:vAlign w:val="center"/>
+          </w:tcPr>
+          <w:p>
+            <w:r>
+              <w:t>Moegammad Green</w:t>
+            </w:r>
+          </w:p>
+        </w:tc>
+        <w:tc>
+          <w:tcPr>
+            <w:tcW w:w="3321" w:type="dxa"/>
+            <w:vAlign w:val="center"/>
+          </w:tcPr>
+          <w:p>
+            <w:pPr>
+              <w:rPr>
+                <w:lang w:val="en-ZA"/>
+              </w:rPr>
+            </w:pPr>
+            <w:r>
+              <w:rPr>
+                <w:lang w:val="en-ZA"/>
+              </w:rPr>
+              <w:t>Fields are listed without storing real personal information</w:t>
+            </w:r>
+          </w:p>
+        </w:tc>
+      </w:tr>
+      <w:tr>
+        <w:trPr>
+          <w:trHeight w:val="567"/>
+        </w:trPr>
+        <w:tc>
+          <w:tcPr>
+            <w:tcW w:w="3320" w:type="dxa"/>
+            <w:vAlign w:val="center"/>
+          </w:tcPr>
+          <w:p>
+            <w:r>
+              <w:t>Screen outline for the three features</w:t>
+            </w:r>
+          </w:p>
+        </w:tc>
+        <w:tc>
+          <w:tcPr>
+            <w:tcW w:w="3321" w:type="dxa"/>
+            <w:vAlign w:val="center"/>
+          </w:tcPr>
+          <w:p>
+            <w:r>
+              <w:t>All</w:t>
+            </w:r>
+          </w:p>
+        </w:tc>
+        <w:tc>
+          <w:tcPr>
+            <w:tcW w:w="3321" w:type="dxa"/>
+            <w:vAlign w:val="center"/>
+          </w:tcPr>
+          <w:p>
+            <w:r>
+              <w:t>The group can demo the intended screens on paper or in a sketch</w:t>
+            </w:r>
+          </w:p>
+        </w:tc>
+      </w:tr>
+    </w:tbl>
+    <w:p>
+      <w:pPr>
+        <w:pStyle w:val="Heading2"/>
+      </w:pPr>
+    </w:p>
+    <w:p>
+      <w:pPr>
+        <w:pStyle w:val="Heading2"/>
+        <w:rPr>
+          <w:lang w:val="en-ZA"/>
+        </w:rPr>
+      </w:pPr>
+      <w:r>
+        <w:rPr>
+          <w:lang w:val="en-ZA"/>
+        </w:rPr>
+        <w:t>Week of 23 October 2026: core build and tests</w:t>
+      </w:r>
+    </w:p>
+    <w:tbl>
+      <w:tblPr>
+        <w:tblStyle w:val="TableGrid"/>
+        <w:tblW w:w="0" w:type="auto"/>
+        <w:tblLook w:val="04A0" w:firstRow="1" w:lastRow="0" w:firstColumn="1" w:lastColumn="0" w:noHBand="0" w:noVBand="1"/>
+      </w:tblPr>
+      <w:tblGrid>
+        <w:gridCol w:w="3320"/>
+        <w:gridCol w:w="3321"/>
+        <w:gridCol w:w="3321"/>
+      </w:tblGrid>
+      <w:tr>
+        <w:trPr>
+          <w:trHeight w:val="567"/>
+        </w:trPr>
+        <w:tc>
+          <w:tcPr>
+            <w:tcW w:w="3320" w:type="dxa"/>
+            <w:vAlign w:val="center"/>
+          </w:tcPr>
+          <w:p>
+            <w:r>
+              <w:t>Task</w:t>
+            </w:r>
+          </w:p>
+        </w:tc>
+        <w:tc>
+          <w:tcPr>
+            <w:tcW w:w="3321" w:type="dxa"/>
+            <w:vAlign w:val="center"/>
+          </w:tcPr>
+          <w:p>
+            <w:r>
+              <w:t>Owner</w:t>
+            </w:r>
+          </w:p>
+        </w:tc>
+        <w:tc>
+          <w:tcPr>
+            <w:tcW w:w="3321" w:type="dxa"/>
+            <w:vAlign w:val="center"/>
+          </w:tcPr>
+          <w:p>
+            <w:r>
+              <w:t>Done when</w:t>
+            </w:r>
+          </w:p>
+        </w:tc>
+      </w:tr>
+      <w:tr>
+        <w:trPr>
+          <w:trHeight w:val="567"/>
+        </w:trPr>
+        <w:tc>
+          <w:tcPr>
+            <w:tcW w:w="3320" w:type="dxa"/>
+            <w:vAlign w:val="center"/>
+          </w:tcPr>
+          <w:p>
+            <w:r>
+              <w:t>Logbook entry with evidence and hours completed</w:t>
+            </w:r>
+          </w:p>
+        </w:tc>
+        <w:tc>
+          <w:tcPr>
+            <w:tcW w:w="3321" w:type="dxa"/>
+            <w:vAlign w:val="center"/>
+          </w:tcPr>
+          <w:p>
+            <w:r>
+              <w:t>Moegammad Green</w:t>
+            </w:r>
+          </w:p>
+        </w:tc>
+        <w:tc>
+          <w:tcPr>
+            <w:tcW w:w="3321" w:type="dxa"/>
+            <w:vAlign w:val="center"/>
+          </w:tcPr>
+          <w:p>
+            <w:r>
+              <w:t>A student can create and view an entry and see progress</w:t>
+            </w:r>
+          </w:p>
+        </w:tc>
+      </w:tr>
+      <w:tr>
+        <w:trPr>
+          <w:trHeight w:val="567"/>
+        </w:trPr>
+        <w:tc>
+          <w:tcPr>
+            <w:tcW w:w="3320" w:type="dxa"/>
+            <w:vAlign w:val="center"/>
+          </w:tcPr>
+          <w:p>
+            <w:r>
+              <w:t>Time-limited token and employer sign-off with no account</w:t>
+            </w:r>
+          </w:p>
+        </w:tc>
+        <w:tc>
+          <w:tcPr>
+            <w:tcW w:w="3321" w:type="dxa"/>
+            <w:vAlign w:val="center"/>
+          </w:tcPr>
+          <w:p>
+            <w:r>
+              <w:t>Moegammad Green</w:t>
+            </w:r>
+          </w:p>
+        </w:tc>
+        <w:tc>
+          <w:tcPr>
+            <w:tcW w:w="3321" w:type="dxa"/>
+            <w:vAlign w:val="center"/>
+          </w:tcPr>
+          <w:p>
+            <w:r>
+              <w:t>A host can open a link, verify, and the token expires</w:t>
+            </w:r>
+          </w:p>
+        </w:tc>
+      </w:tr>
+      <w:tr>
+        <w:trPr>
+          <w:trHeight w:val="567"/>
+        </w:trPr>
+        <w:tc>
+          <w:tcPr>
+            <w:tcW w:w="3320" w:type="dxa"/>
+            <w:vAlign w:val="center"/>
+          </w:tcPr>
+          <w:p>
+            <w:r>
+              <w:lastRenderedPageBreak/>
+              <w:t>Coordinator dashboard: on-track, awaiting, overdue</w:t>
+            </w:r>
+          </w:p>
+        </w:tc>
+        <w:tc>
+          <w:tcPr>
+            <w:tcW w:w="3321" w:type="dxa"/>
+            <w:vAlign w:val="center"/>
+          </w:tcPr>
+          <w:p>
+            <w:r>
+              <w:t>Sihle Kayise</w:t>
+            </w:r>
+          </w:p>
+        </w:tc>
+        <w:tc>
+          <w:tcPr>
+            <w:tcW w:w="3321" w:type="dxa"/>
+            <w:vAlign w:val="center"/>
+          </w:tcPr>
+          <w:p>
+            <w:r>
+              <w:t>A coordinator can see those three states from synthetic records</w:t>
+            </w:r>
+          </w:p>
+        </w:tc>
+      </w:tr>
+      <w:tr>
+        <w:trPr>
+          <w:trHeight w:val="567"/>
+        </w:trPr>
+        <w:tc>
+          <w:tcPr>
+            <w:tcW w:w="3320" w:type="dxa"/>
+            <w:vAlign w:val="center"/>
+          </w:tcPr>
+          <w:p>
+            <w:r>
+              <w:t>Tests of the three core features</w:t>
+            </w:r>
+          </w:p>
+        </w:tc>
+        <w:tc>
+          <w:tcPr>
+            <w:tcW w:w="3321" w:type="dxa"/>
+            <w:vAlign w:val="center"/>
+          </w:tcPr>
+          <w:p>
+            <w:r>
+              <w:t>Dylan Shepard</w:t>
+            </w:r>
+          </w:p>
+        </w:tc>
+        <w:tc>
+          <w:tcPr>
+            <w:tcW w:w="3321" w:type="dxa"/>
+            <w:vAlign w:val="center"/>
+          </w:tcPr>
+          <w:p>
+            <w:r>
+              <w:t>Each feature has a recorded pass or a listed defect</w:t>
+            </w:r>
+          </w:p>
+        </w:tc>
+      </w:tr>
+      <w:tr>
+        <w:trPr>
+          <w:trHeight w:val="567"/>
+        </w:trPr>
+        <w:tc>
+          <w:tcPr>
+            <w:tcW w:w="3320" w:type="dxa"/>
+            <w:vAlign w:val="center"/>
+          </w:tcPr>
+          <w:p>
+            <w:r>
+              <w:t>Fix defects that block the demo</w:t>
+            </w:r>
+          </w:p>
+        </w:tc>
+        <w:tc>
+          <w:tcPr>
+            <w:tcW w:w="3321" w:type="dxa"/>
+            <w:vAlign w:val="center"/>
+          </w:tcPr>
+          <w:p>
+            <w:r>
+              <w:t>Moegammad Green, with Dylan Shepard</w:t>
+            </w:r>
+          </w:p>
+        </w:tc>
+        <w:tc>
+          <w:tcPr>
+            <w:tcW w:w="3321" w:type="dxa"/>
+            <w:vAlign w:val="center"/>
+          </w:tcPr>
+          <w:p>
+            <w:r>
+              <w:t>The three features run together for the demonstration</w:t>
+            </w:r>
+          </w:p>
+        </w:tc>
+      </w:tr>
+    </w:tbl>
+    <w:p>
+      <w:pPr>
+        <w:pStyle w:val="Heading2"/>
+      </w:pPr>
+    </w:p>
+    <w:p>
+      <w:pPr>
+        <w:pStyle w:val="Heading2"/>
+      </w:pPr>
+      <w:r>
+        <w:t>Week of 29 October 2026: submit and demonstrate</w:t>
+      </w:r>
+    </w:p>
+    <w:tbl>
+      <w:tblPr>
+        <w:tblStyle w:val="TableGrid"/>
+        <w:tblW w:w="0" w:type="auto"/>
+        <w:tblLook w:val="04A0" w:firstRow="1" w:lastRow="0" w:firstColumn="1" w:lastColumn="0" w:noHBand="0" w:noVBand="1"/>
+      </w:tblPr>
+      <w:tblGrid>
+        <w:gridCol w:w="3320"/>
+        <w:gridCol w:w="3321"/>
+        <w:gridCol w:w="3321"/>
+      </w:tblGrid>
+      <w:tr>
+        <w:trPr>
+          <w:trHeight w:val="567"/>
+        </w:trPr>
+        <w:tc>
+          <w:tcPr>
+            <w:tcW w:w="3320" w:type="dxa"/>
+            <w:vAlign w:val="center"/>
+          </w:tcPr>
+          <w:p>
+            <w:r>
+              <w:t>Task</w:t>
+            </w:r>
+          </w:p>
+        </w:tc>
+        <w:tc>
+          <w:tcPr>
+            <w:tcW w:w="3321" w:type="dxa"/>
+            <w:vAlign w:val="center"/>
+          </w:tcPr>
+          <w:p>
+            <w:r>
+              <w:t>Owner</w:t>
+            </w:r>
+          </w:p>
+        </w:tc>
+        <w:tc>
+          <w:tcPr>
+            <w:tcW w:w="3321" w:type="dxa"/>
+            <w:vAlign w:val="center"/>
+          </w:tcPr>
+          <w:p>
+            <w:r>
+              <w:t>Done when</w:t>
+            </w:r>
+          </w:p>
+        </w:tc>
+      </w:tr>
+      <w:tr>
+        <w:trPr>
+          <w:trHeight w:val="567"/>
+        </w:trPr>
+        <w:tc>
+          <w:tcPr>
+            <w:tcW w:w="3320" w:type="dxa"/>
+            <w:vAlign w:val="center"/>
+          </w:tcPr>
+          <w:p>
+            <w:r>
+              <w:t>Dissertation chapters and evidence folders</w:t>
+            </w:r>
+          </w:p>
+        </w:tc>
+        <w:tc>
+          <w:tcPr>
+            <w:tcW w:w="3321" w:type="dxa"/>
+            <w:vAlign w:val="center"/>
+          </w:tcPr>
+          <w:p>
+            <w:r>
+              <w:t>Willem Basson</w:t>
+            </w:r>
+          </w:p>
+        </w:tc>
+        <w:tc>
+          <w:tcPr>
+            <w:tcW w:w="3321" w:type="dxa"/>
+            <w:vAlign w:val="center"/>
+          </w:tcPr>
+          <w:p>
+            <w:r>
+              <w:t>Folders match the module submission list</w:t>
+            </w:r>
+          </w:p>
+        </w:tc>
+      </w:tr>
+      <w:tr>
+        <w:trPr>
+          <w:trHeight w:val="567"/>
+        </w:trPr>
+        <w:tc>
+          <w:tcPr>
+            <w:tcW w:w="3320" w:type="dxa"/>
+            <w:vAlign w:val="center"/>
+          </w:tcPr>
+          <w:p>
+            <w:r>
+              <w:t>Working app on synthetic data</w:t>
+            </w:r>
+          </w:p>
+        </w:tc>
+        <w:tc>
+          <w:tcPr>
+            <w:tcW w:w="3321" w:type="dxa"/>
+            <w:vAlign w:val="center"/>
+          </w:tcPr>
+          <w:p>
+            <w:r>
+              <w:t>M</w:t>
+            </w:r>
+            <w:r>
+              <w:t>oegammad Green</w:t>
+            </w:r>
+          </w:p>
+        </w:tc>
+        <w:tc>
+          <w:tcPr>
+            <w:tcW w:w="3321" w:type="dxa"/>
+            <w:vAlign w:val="center"/>
+          </w:tcPr>
+          <w:p>
+            <w:r>
+              <w:t>Demo path is logbook, token, then dashboard</w:t>
+            </w:r>
+          </w:p>
+        </w:tc>
+      </w:tr>
+      <w:tr>
+        <w:trPr>
+          <w:trHeight w:val="567"/>
+        </w:trPr>
+        <w:tc>
+          <w:tcPr>
+            <w:tcW w:w="3320" w:type="dxa"/>
+            <w:vAlign w:val="center"/>
+          </w:tcPr>
+          <w:p>
+            <w:r>
+              <w:t>Test evidence</w:t>
+            </w:r>
+          </w:p>
+        </w:tc>
+        <w:tc>
+          <w:tcPr>
+            <w:tcW w:w="3321" w:type="dxa"/>
+            <w:vAlign w:val="center"/>
+          </w:tcPr>
+          <w:p>
+            <w:r>
+              <w:t>Dylan Shepard</w:t>
+            </w:r>
+          </w:p>
+        </w:tc>
+        <w:tc>
+          <w:tcPr>
+            <w:tcW w:w="3321" w:type="dxa"/>
+            <w:vAlign w:val="center"/>
+          </w:tcPr>
+          <w:p>
+            <w:r>
+              <w:t>Test notes sit with the build evidence</w:t>
+            </w:r>
+          </w:p>
+        </w:tc>
+      </w:tr>
+      <w:tr>
+        <w:trPr>
+          <w:trHeight w:val="567"/>
+        </w:trPr>
+        <w:tc>
+          <w:tcPr>
+            <w:tcW w:w="3320" w:type="dxa"/>
+            <w:vAlign w:val="center"/>
+          </w:tcPr>
+          <w:p>
+            <w:r>
+              <w:t>Demonstration</w:t>
+            </w:r>
+          </w:p>
+        </w:tc>
+        <w:tc>
+          <w:tcPr>
+            <w:tcW w:w="3321" w:type="dxa"/>
+            <w:vAlign w:val="center"/>
+          </w:tcPr>
+          <w:p>
+            <w:r>
+              <w:t>All</w:t>
+            </w:r>
+          </w:p>
+        </w:tc>
+        <w:tc>
+          <w:tcPr>
+            <w:tcW w:w="3321" w:type="dxa"/>
+            <w:vAlign w:val="center"/>
+          </w:tcPr>
+          <w:p>
+            <w:r>
+              <w:t>The group shows the three core features to the supervisor</w:t>
+            </w:r>
+          </w:p>
+        </w:tc>
+      </w:tr>
+    </w:tbl>
+    <w:p/>
     <w:sectPr>
       <w:headerReference w:type="default" r:id="rId8"/>
       <w:footerReference w:type="default" r:id="rId9"/>
@@ -1173,7 +2138,7 @@
   <w:style w:type="paragraph" w:default="1" w:styleId="Normal">
     <w:name w:val="Normal"/>
     <w:qFormat/>
-    <w:rsid w:val="00FC693F"/>
+    <w:rsid w:val="008C0E46"/>
     <w:rPr>
       <w:rFonts w:ascii="Arial" w:hAnsi="Arial"/>
     </w:rPr>
@@ -1390,7 +2355,6 @@
   <w:style w:type="character" w:default="1" w:styleId="DefaultParagraphFont">
     <w:name w:val="Default Paragraph Font"/>
     <w:uiPriority w:val="1"/>
-    <w:semiHidden/>
     <w:unhideWhenUsed/>
   </w:style>
   <w:style w:type="table" w:default="1" w:styleId="TableNormal">

</xml_diff>

<commit_message>
Final changes made for week 3 submission, merged everything into one pdf. Folder Week 3 Submission for further information.
</commit_message>
<xml_diff>
--- a/09_Project_Management_Evidence/Project_Charter_and_Work_Plan.docx
+++ b/09_Project_Management_Evidence/Project_Charter_and_Work_Plan.docx
@@ -4,7 +4,7 @@
   <w:body>
     <w:p>
       <w:pPr>
-        <w:jc w:val="center"/>
+        <w:ind w:left="720"/>
       </w:pPr>
       <w:r>
         <w:rPr>
@@ -17,205 +17,22 @@
           <w:b/>
         </w:rPr>
         <w:br/>
-        <w:t>CAPSTONE PROJECT</w:t>
       </w:r>
-      <w:r>
-        <w:rPr>
-          <w:b/>
-        </w:rPr>
-        <w:br/>
-      </w:r>
+      <w:proofErr w:type="spellStart"/>
       <w:r>
         <w:rPr>
           <w:b/>
           <w:sz w:val="40"/>
         </w:rPr>
-        <w:t>PROJECT CHARTER &amp; WORK PLAN</w:t>
+        <w:t>PROJECT</w:t>
       </w:r>
+      <w:proofErr w:type="spellEnd"/>
       <w:r>
-        <w:br/>
-      </w:r>
-      <w:r>
-        <w:br/>
-        <w:t>Student / Group Template</w:t>
-      </w:r>
-      <w:r>
-        <w:br/>
-      </w:r>
-      <w:r>
-        <w:br/>
-      </w:r>
-    </w:p>
-    <w:tbl>
-      <w:tblPr>
-        <w:tblW w:w="0" w:type="auto"/>
-        <w:jc w:val="center"/>
-        <w:tblLook w:val="04A0" w:firstRow="1" w:lastRow="0" w:firstColumn="1" w:lastColumn="0" w:noHBand="0" w:noVBand="1"/>
-      </w:tblPr>
-      <w:tblGrid>
-        <w:gridCol w:w="4986"/>
-        <w:gridCol w:w="4986"/>
-      </w:tblGrid>
-      <w:tr>
-        <w:trPr>
-          <w:jc w:val="center"/>
-        </w:trPr>
-        <w:tc>
-          <w:tcPr>
-            <w:tcW w:w="4986" w:type="dxa"/>
-            <w:shd w:val="clear" w:color="auto" w:fill="D9EAF0"/>
-          </w:tcPr>
-          <w:p>
-            <w:r>
-              <w:t>Project Title</w:t>
-            </w:r>
-          </w:p>
-        </w:tc>
-        <w:tc>
-          <w:tcPr>
-            <w:tcW w:w="4986" w:type="dxa"/>
-          </w:tcPr>
-          <w:p>
-            <w:r>
-              <w:t>TrackWIL</w:t>
-            </w:r>
-          </w:p>
-        </w:tc>
-      </w:tr>
-      <w:tr>
-        <w:trPr>
-          <w:jc w:val="center"/>
-        </w:trPr>
-        <w:tc>
-          <w:tcPr>
-            <w:tcW w:w="4986" w:type="dxa"/>
-            <w:shd w:val="clear" w:color="auto" w:fill="D9EAF0"/>
-          </w:tcPr>
-          <w:p>
-            <w:r>
-              <w:t>Group Members</w:t>
-            </w:r>
-          </w:p>
-        </w:tc>
-        <w:tc>
-          <w:tcPr>
-            <w:tcW w:w="4986" w:type="dxa"/>
-          </w:tcPr>
-          <w:p>
-            <w:r>
-              <w:t>Willem Basson, Dylan Shepard, Moe Green, Sihle Kayise</w:t>
-            </w:r>
-          </w:p>
-        </w:tc>
-      </w:tr>
-      <w:tr>
-        <w:trPr>
-          <w:jc w:val="center"/>
-        </w:trPr>
-        <w:tc>
-          <w:tcPr>
-            <w:tcW w:w="4986" w:type="dxa"/>
-            <w:shd w:val="clear" w:color="auto" w:fill="D9EAF0"/>
-          </w:tcPr>
-          <w:p>
-            <w:r>
-              <w:t>Module</w:t>
-            </w:r>
-          </w:p>
-        </w:tc>
-        <w:tc>
-          <w:tcPr>
-            <w:tcW w:w="4986" w:type="dxa"/>
-          </w:tcPr>
-          <w:p>
-            <w:r>
-              <w:t>SPM622</w:t>
-            </w:r>
-          </w:p>
-        </w:tc>
-      </w:tr>
-      <w:tr>
-        <w:trPr>
-          <w:jc w:val="center"/>
-        </w:trPr>
-        <w:tc>
-          <w:tcPr>
-            <w:tcW w:w="4986" w:type="dxa"/>
-            <w:shd w:val="clear" w:color="auto" w:fill="D9EAF0"/>
-          </w:tcPr>
-          <w:p>
-            <w:r>
-              <w:t>Lecturer / Supervisor</w:t>
-            </w:r>
-          </w:p>
-        </w:tc>
-        <w:tc>
-          <w:tcPr>
-            <w:tcW w:w="4986" w:type="dxa"/>
-          </w:tcPr>
-          <w:p>
-            <w:r>
-              <w:t>Amanda Raganya</w:t>
-            </w:r>
-          </w:p>
-        </w:tc>
-      </w:tr>
-      <w:tr>
-        <w:trPr>
-          <w:jc w:val="center"/>
-        </w:trPr>
-        <w:tc>
-          <w:tcPr>
-            <w:tcW w:w="4986" w:type="dxa"/>
-            <w:shd w:val="clear" w:color="auto" w:fill="D9EAF0"/>
-          </w:tcPr>
-          <w:p>
-            <w:r>
-              <w:t>Week / Stage</w:t>
-            </w:r>
-          </w:p>
-        </w:tc>
-        <w:tc>
-          <w:tcPr>
-            <w:tcW w:w="4986" w:type="dxa"/>
-          </w:tcPr>
-          <w:p>
-            <w:r>
-              <w:t>Week 2</w:t>
-            </w:r>
-          </w:p>
-        </w:tc>
-      </w:tr>
-      <w:tr>
-        <w:trPr>
-          <w:jc w:val="center"/>
-        </w:trPr>
-        <w:tc>
-          <w:tcPr>
-            <w:tcW w:w="4986" w:type="dxa"/>
-            <w:shd w:val="clear" w:color="auto" w:fill="D9EAF0"/>
-          </w:tcPr>
-          <w:p>
-            <w:r>
-              <w:t>Submission Date</w:t>
-            </w:r>
-          </w:p>
-        </w:tc>
-        <w:tc>
-          <w:tcPr>
-            <w:tcW w:w="4986" w:type="dxa"/>
-          </w:tcPr>
-          <w:p>
-            <w:r>
-              <w:t>29 October 2026</w:t>
-            </w:r>
-          </w:p>
-        </w:tc>
-      </w:tr>
-    </w:tbl>
-    <w:p>
-      <w:r>
-        <w:br w:type="page"/>
+        <w:rPr>
+          <w:b/>
+          <w:sz w:val="40"/>
+        </w:rPr>
+        <w:t xml:space="preserve"> CHARTER &amp; WORK PLAN</w:t>
       </w:r>
     </w:p>
     <w:p>
@@ -223,7 +40,6 @@
         <w:pStyle w:val="Heading1"/>
       </w:pPr>
       <w:r>
-        <w:lastRenderedPageBreak/>
         <w:t>Project Overview</w:t>
       </w:r>
     </w:p>
@@ -438,8 +254,13 @@
       </w:r>
     </w:p>
     <w:p>
+      <w:proofErr w:type="spellStart"/>
       <w:r>
-        <w:t>Ms Amenda Raganya records supervisor approval after the Week 2 review.</w:t>
+        <w:t>Ms</w:t>
+      </w:r>
+      <w:proofErr w:type="spellEnd"/>
+      <w:r>
+        <w:t xml:space="preserve"> Amenda Raganya records supervisor approval after the Week 2 review.</w:t>
       </w:r>
     </w:p>
     <w:p>
@@ -939,11 +760,13 @@
         </w:tc>
       </w:tr>
     </w:tbl>
-    <w:p>
-      <w:pPr>
-        <w:pStyle w:val="Heading2"/>
-      </w:pPr>
-    </w:p>
+    <w:p/>
+    <w:p/>
+    <w:p/>
+    <w:p/>
+    <w:p/>
+    <w:p/>
+    <w:p/>
     <w:p>
       <w:pPr>
         <w:pStyle w:val="Heading2"/>
@@ -955,6 +778,7 @@
         <w:rPr>
           <w:lang w:val="en-ZA"/>
         </w:rPr>
+        <w:lastRenderedPageBreak/>
         <w:t>Week of 23 October 2026: core build and tests</w:t>
       </w:r>
     </w:p>
@@ -1029,7 +853,7 @@
           </w:tcPr>
           <w:p>
             <w:r>
-              <w:t>Moegammad Green</w:t>
+              <w:t>Willem Basson</w:t>
             </w:r>
           </w:p>
         </w:tc>
@@ -1094,7 +918,6 @@
           </w:tcPr>
           <w:p>
             <w:r>
-              <w:lastRenderedPageBreak/>
               <w:t>Coordinator dashboard: on-track, awaiting, overdue</w:t>
             </w:r>
           </w:p>
@@ -1502,46 +1325,6 @@
     <w:pPr>
       <w:jc w:val="center"/>
     </w:pPr>
-    <w:r>
-      <w:rPr>
-        <w:noProof/>
-      </w:rPr>
-      <w:drawing>
-        <wp:inline distT="0" distB="0" distL="0" distR="0" wp14:anchorId="47212F4B" wp14:editId="5F202450">
-          <wp:extent cx="2057400" cy="658368"/>
-          <wp:effectExtent l="0" t="0" r="0" b="0"/>
-          <wp:docPr id="1" name="Picture 1"/>
-          <wp:cNvGraphicFramePr>
-            <a:graphicFrameLocks xmlns:a="http://schemas.openxmlformats.org/drawingml/2006/main" noChangeAspect="1"/>
-          </wp:cNvGraphicFramePr>
-          <a:graphic xmlns:a="http://schemas.openxmlformats.org/drawingml/2006/main">
-            <a:graphicData uri="http://schemas.openxmlformats.org/drawingml/2006/picture">
-              <pic:pic xmlns:pic="http://schemas.openxmlformats.org/drawingml/2006/picture">
-                <pic:nvPicPr>
-                  <pic:cNvPr id="0" name="image(20261006-065454).png"/>
-                  <pic:cNvPicPr/>
-                </pic:nvPicPr>
-                <pic:blipFill>
-                  <a:blip r:embed="rId1"/>
-                  <a:stretch>
-                    <a:fillRect/>
-                  </a:stretch>
-                </pic:blipFill>
-                <pic:spPr>
-                  <a:xfrm>
-                    <a:off x="0" y="0"/>
-                    <a:ext cx="2057400" cy="658368"/>
-                  </a:xfrm>
-                  <a:prstGeom prst="rect">
-                    <a:avLst/>
-                  </a:prstGeom>
-                </pic:spPr>
-              </pic:pic>
-            </a:graphicData>
-          </a:graphic>
-        </wp:inline>
-      </w:drawing>
-    </w:r>
   </w:p>
 </w:hdr>
 </file>
@@ -2355,6 +2138,7 @@
   <w:style w:type="character" w:default="1" w:styleId="DefaultParagraphFont">
     <w:name w:val="Default Paragraph Font"/>
     <w:uiPriority w:val="1"/>
+    <w:semiHidden/>
     <w:unhideWhenUsed/>
   </w:style>
   <w:style w:type="table" w:default="1" w:styleId="TableNormal">

</xml_diff>